<commit_message>
Polish REPLAY LAB and publish 18-slide deck with ordering demo
</commit_message>
<xml_diff>
--- a/downloads/REPLAY_LAB_Script.docx
+++ b/downloads/REPLAY_LAB_Script.docx
@@ -15,7 +15,7 @@
       <w:r>
         <w:rPr>
           <w:i/>
-          <w:color w:val="76647C"/>
+          <w:color w:val="776C7B"/>
           <w:sz w:val="18"/>
         </w:rPr>
         <w:t>Childhood, remade. / English speaking script / five-minute video</w:t>
@@ -32,7 +32,7 @@
     <w:p>
       <w:pPr/>
       <w:r>
-        <w:t>526 spoken words. Slides 1–11 cover the story; slide 12 is a silent five-second source card. Slide 13 is a hidden appendix. The target is 4 minutes 50 seconds including the demo and credits, leaving 10 seconds below the limit. Speak at about 120 words per minute; actual recording length must be checked. Record a rehearsal after inserting your own evidence.</w:t>
+        <w:t>561 spoken words. Slides 1–17 cover the story; slide 18 is a silent five-second source card. Slide 11 includes a 25-second recorded website demo. Speak its narration over the clip; do not add the clip as extra time. The target is 4 minutes 50 seconds including the demo and credits, leaving 10 seconds below the limit. Speak at about 120 words per minute; actual recording length must be checked. Record a rehearsal after inserting your own evidence.</w:t>
       </w:r>
     </w:p>
     <w:p>
@@ -60,7 +60,7 @@
     <w:p>
       <w:pPr/>
       <w:r>
-        <w:t>Slide 3 is an honest pre-fieldwork version. Replace it with your own dated observations or interviews before submission. Demo votes, saved designs, simulated reservations are not real consumer research. The questionnaire helps collect evidence; blank forms are not findings.</w:t>
+        <w:t>Slide 4 is an honest pre-fieldwork version. Replace it with your own dated observations or interviews before submission. Demo votes, saved designs, simulated reservations are not real consumer research. The questionnaire helps collect evidence; blank forms are not findings.</w:t>
       </w:r>
     </w:p>
     <w:tbl>
@@ -113,7 +113,7 @@
           </w:tcPr>
           <w:p>
             <w:r>
-              <w:t>0:00–1:00</w:t>
+              <w:t>0:00–0:55</w:t>
             </w:r>
           </w:p>
         </w:tc>
@@ -123,7 +123,7 @@
           </w:tcPr>
           <w:p>
             <w:r>
-              <w:t>1–3</w:t>
+              <w:t>1–4</w:t>
             </w:r>
           </w:p>
         </w:tc>
@@ -133,7 +133,7 @@
           </w:tcPr>
           <w:p>
             <w:r>
-              <w:t>Spot the change + evidence</w:t>
+              <w:t>Reported change + original evidence</w:t>
             </w:r>
           </w:p>
         </w:tc>
@@ -145,7 +145,7 @@
           </w:tcPr>
           <w:p>
             <w:r>
-              <w:t>1:00–2:05</w:t>
+              <w:t>0:55–1:50</w:t>
             </w:r>
           </w:p>
         </w:tc>
@@ -155,7 +155,7 @@
           </w:tcPr>
           <w:p>
             <w:r>
-              <w:t>4–5</w:t>
+              <w:t>5–7</w:t>
             </w:r>
           </w:p>
         </w:tc>
@@ -165,7 +165,7 @@
           </w:tcPr>
           <w:p>
             <w:r>
-              <w:t>Two class concepts</w:t>
+              <w:t>Audience + two class concepts</w:t>
             </w:r>
           </w:p>
         </w:tc>
@@ -177,7 +177,7 @@
           </w:tcPr>
           <w:p>
             <w:r>
-              <w:t>2:05–3:20</w:t>
+              <w:t>1:50–3:30</w:t>
             </w:r>
           </w:p>
         </w:tc>
@@ -187,7 +187,7 @@
           </w:tcPr>
           <w:p>
             <w:r>
-              <w:t>6–8</w:t>
+              <w:t>8–13</w:t>
             </w:r>
           </w:p>
         </w:tc>
@@ -197,7 +197,7 @@
           </w:tcPr>
           <w:p>
             <w:r>
-              <w:t>REPLAY LAB opportunity + demo</w:t>
+              <w:t>Opportunity + design + recorded demo + revenue</w:t>
             </w:r>
           </w:p>
         </w:tc>
@@ -209,7 +209,7 @@
           </w:tcPr>
           <w:p>
             <w:r>
-              <w:t>3:20–4:45</w:t>
+              <w:t>3:30–4:45</w:t>
             </w:r>
           </w:p>
         </w:tc>
@@ -219,7 +219,7 @@
           </w:tcPr>
           <w:p>
             <w:r>
-              <w:t>9–11</w:t>
+              <w:t>14–17</w:t>
             </w:r>
           </w:p>
         </w:tc>
@@ -229,7 +229,7 @@
           </w:tcPr>
           <w:p>
             <w:r>
-              <w:t>Risk, economics and recommendation</w:t>
+              <w:t>Risk, economics, validation and decision</w:t>
             </w:r>
           </w:p>
         </w:tc>
@@ -251,7 +251,7 @@
           </w:tcPr>
           <w:p>
             <w:r>
-              <w:t>12</w:t>
+              <w:t>18</w:t>
             </w:r>
           </w:p>
         </w:tc>
@@ -278,7 +278,7 @@
     <w:p>
       <w:pPr/>
       <w:r>
-        <w:t>The included Press Start 2P font is used for small labels and the opening title. Install assets/pixel.ttf before editing the PPTX if the font is missing. PDF and PNG versions preserve the design. Body text is Arial for readability.</w:t>
+        <w:t>The included Press Start 2P font is used for small labels. Headlines and body text use Arial for reliable editing. Install assets/pixel.ttf before editing the PPTX if the font is missing. PDF and PNG versions preserve the design. Body text is Arial for readability.</w:t>
       </w:r>
     </w:p>
     <w:p>
@@ -299,13 +299,13 @@
         <w:pStyle w:val="Heading2"/>
       </w:pPr>
       <w:r>
-        <w:t>0:00–0:15 | Slide 1: Childhood, remade.</w:t>
+        <w:t>0:00–0:10 | Slide 1: Good memories. Made tangible.</w:t>
       </w:r>
     </w:p>
     <w:p>
       <w:pPr/>
       <w:r>
-        <w:t>A toy can carry a memory. This project explores working adults in Thailand returning to squishies and slime. Could those memories support a more personal product? Meet REPLAY LAB.</w:t>
+        <w:t>A toy can carry a memory. REPLAY LAB explores how working adults might turn childhood wishes into personal squishies and slime.</w:t>
       </w:r>
     </w:p>
     <w:p>
@@ -313,10 +313,10 @@
       <w:r>
         <w:rPr>
           <w:i/>
-          <w:color w:val="76647C"/>
+          <w:color w:val="776C7B"/>
           <w:sz w:val="18"/>
         </w:rPr>
-        <w:t>Visual: Open with the original pixel-art childhood desk. It illustrates the concept and is not fieldwork.</w:t>
+        <w:t>Visual: Open on the original product artwork and brand promise. It is concept art, not fieldwork.</w:t>
       </w:r>
     </w:p>
     <w:p>
@@ -324,13 +324,13 @@
         <w:pStyle w:val="Heading2"/>
       </w:pPr>
       <w:r>
-        <w:t>0:15–0:40 | Slide 2: Old toys. New spending power.</w:t>
+        <w:t>0:10–0:25 | Slide 2: A revival worth investigating.</w:t>
       </w:r>
     </w:p>
     <w:p>
       <w:pPr/>
       <w:r>
-        <w:t>Thai PBS World reported a toy revival at Sampheng in June twenty twenty-six. A vendor described working adults buying toys they had wanted as children but could not afford. Social reviews brought the toys back into view. This is a local signal, not a measure of the whole Thai market.</w:t>
+        <w:t>Thai PBS World reported a toy revival at Sampheng in June twenty twenty-six. Thairath reported a broader revival at Mega Plaza. These are local signals, not a market-size estimate.</w:t>
       </w:r>
     </w:p>
     <w:p>
@@ -338,10 +338,10 @@
       <w:r>
         <w:rPr>
           <w:i/>
-          <w:color w:val="76647C"/>
+          <w:color w:val="776C7B"/>
           <w:sz w:val="18"/>
         </w:rPr>
-        <w:t>Visual: Show the dated Sampheng account, then the change in the buyer’s situation. Source S1.</w:t>
+        <w:t>Visual: Compare the two dated sources. S1 supports the reported adult-return account; S2 supports the broader sensory-toy revival.</w:t>
       </w:r>
     </w:p>
     <w:p>
@@ -349,13 +349,13 @@
         <w:pStyle w:val="Heading2"/>
       </w:pPr>
       <w:r>
-        <w:t>0:40–1:00 | Slide 3: Check who is actually buying.</w:t>
+        <w:t>0:25–0:40 | Slide 3: The toy is familiar. The buyer’s situation has changed.</w:t>
       </w:r>
     </w:p>
     <w:p>
       <w:pPr/>
       <w:r>
-        <w:t>Original fieldwork is still pending. Thairath’s Mega Plaza visit mainly found children and teenagers, so I need to confirm adult buyers directly. My questionnaire asks about actual purchases, childhood memories and social discovery before introducing REPLAY LAB.</w:t>
+        <w:t>The Sampheng vendor described working adults buying toys they had wanted but could not afford as children. The product is familiar; adult income changes the buyer’s freedom to choose.</w:t>
       </w:r>
     </w:p>
     <w:p>
@@ -363,10 +363,98 @@
       <w:r>
         <w:rPr>
           <w:i/>
-          <w:color w:val="76647C"/>
+          <w:color w:val="776C7B"/>
           <w:sz w:val="18"/>
         </w:rPr>
-        <w:t>Visual: Replace the pending panel with your dated photo, actual interview counts and one consented quote. The second report is not personal evidence. S2.</w:t>
+        <w:t>Visual: Show the before/after buying context. These are analytical labels, not participant quotations. Cite S1.</w:t>
+      </w:r>
+    </w:p>
+    <w:p>
+      <w:r>
+        <w:br w:type="page"/>
+      </w:r>
+    </w:p>
+    <w:p>
+      <w:pPr>
+        <w:pStyle w:val="Heading1"/>
+      </w:pPr>
+      <w:r>
+        <w:t>Spot the change</w:t>
+      </w:r>
+    </w:p>
+    <w:p>
+      <w:pPr>
+        <w:pStyle w:val="Heading2"/>
+      </w:pPr>
+      <w:r>
+        <w:t>0:40–0:55 | Slide 4: A promising signal. An evidence gap to close.</w:t>
+      </w:r>
+    </w:p>
+    <w:p>
+      <w:pPr/>
+      <w:r>
+        <w:t>Original fieldwork is still pending. Mega Plaza’s observed buyers were mainly children and teenagers. I need direct evidence from working adults, asking about actual purchases before showing the business idea.</w:t>
+      </w:r>
+    </w:p>
+    <w:p>
+      <w:pPr/>
+      <w:r>
+        <w:rPr>
+          <w:i/>
+          <w:color w:val="776C7B"/>
+          <w:sz w:val="18"/>
+        </w:rPr>
+        <w:t>Visual: Replace this plan with actual dated observations, buyer counts and one consented quote before submission. Published news is not personal fieldwork.</w:t>
+      </w:r>
+    </w:p>
+    <w:p>
+      <w:pPr>
+        <w:pStyle w:val="Heading2"/>
+      </w:pPr>
+      <w:r>
+        <w:t>0:55–1:10 | Slide 5: Design for a specific buyer.</w:t>
+      </w:r>
+    </w:p>
+    <w:p>
+      <w:pPr/>
+      <w:r>
+        <w:t>The proposed target is early-career Thai adults buying for their own enjoyment or collection. A desk, display or everyday break provides a possible use context. These preferences still need testing.</w:t>
+      </w:r>
+    </w:p>
+    <w:p>
+      <w:pPr/>
+      <w:r>
+        <w:rPr>
+          <w:i/>
+          <w:color w:val="776C7B"/>
+          <w:sz w:val="18"/>
+        </w:rPr>
+        <w:t>Visual: Identify the proposed target and use context. Do not describe this as a researched persona.</w:t>
+      </w:r>
+    </w:p>
+    <w:p>
+      <w:pPr>
+        <w:pStyle w:val="Heading2"/>
+      </w:pPr>
+      <w:r>
+        <w:t>1:10–1:30 | Slide 6: Memory can change what a toy is worth.</w:t>
+      </w:r>
+    </w:p>
+    <w:p>
+      <w:pPr/>
+      <w:r>
+        <w:t>Emotional motivation explains why a familiar object may matter. Memory adds personal meaning, texture offers enjoyment, and adult income enables choice. My interpretation is that these benefits can combine. Whether buyers would pay more remains an open question.</w:t>
+      </w:r>
+    </w:p>
+    <w:p>
+      <w:pPr/>
+      <w:r>
+        <w:rPr>
+          <w:i/>
+          <w:color w:val="776C7B"/>
+          <w:sz w:val="18"/>
+        </w:rPr>
+        <w:t>Visual: Explain memory, enjoyment and choice as an interpretation to test. No medical benefit or price premium is established.</w:t>
       </w:r>
     </w:p>
     <w:p>
@@ -387,13 +475,13 @@
         <w:pStyle w:val="Heading2"/>
       </w:pPr>
       <w:r>
-        <w:t>1:00–1:30 | Slide 4: The memory changes the value.</w:t>
+        <w:t>1:30–1:50 | Slide 7: Discovery gets attention. Meaning may explain the purchase.</w:t>
       </w:r>
     </w:p>
     <w:p>
       <w:pPr/>
       <w:r>
-        <w:t>Emotional motivation explains why a familiar toy can matter beyond its practical use. In the Sampheng account, adult income makes a childhood wish possible. My interpretation is that the purchase combines enjoyment, memory and personal choice. REPLAY LAB builds on this meaning by inviting buyers to contribute a childhood theme. Whether they would pay more still needs testing.</w:t>
+        <w:t>Social influence helps explain rediscovery. Reviews bring toys back into view, and seeing other adults play may make buying feel acceptable. Discovery and motivation differ: a review may attract attention while memory explains the choice. Paid demand still needs testing.</w:t>
       </w:r>
     </w:p>
     <w:p>
@@ -401,10 +489,10 @@
       <w:r>
         <w:rPr>
           <w:i/>
-          <w:color w:val="76647C"/>
+          <w:color w:val="776C7B"/>
           <w:sz w:val="18"/>
         </w:rPr>
-        <w:t>Visual: Separate the source account from the interpretation. Use the pixel pencil case and game console as original concept objects. S1.</w:t>
+        <w:t>Visual: Follow reported discovery, interpreted relevance and a real choice still to test. S1 supports the first stage.</w:t>
       </w:r>
     </w:p>
     <w:p>
@@ -412,13 +500,13 @@
         <w:pStyle w:val="Heading2"/>
       </w:pPr>
       <w:r>
-        <w:t>1:30–2:05 | Slide 5: Social discovery brings the idea back.</w:t>
+        <w:t>1:50–2:05 | Slide 8: Bring a familiar memory into my everyday life.</w:t>
       </w:r>
     </w:p>
     <w:p>
       <w:pPr/>
       <w:r>
-        <w:t>Social influence helps explain rediscovery. Thai PBS World links renewed attention to influencer and celebrity reviews. Seeing other adults enjoying toys may also make buying feel more acceptable. But discovery and motivation differ: a review may attract attention while a memory explains the spending. Shared designs could spread REPLAY LAB, but a vote or shared link is not a paid order.</w:t>
+        <w:t>Our proposed value is simple: bring a familiar memory into everyday life. Customers get a recognisable theme, personal design choices and clear product information. This is a hypothesis to test.</w:t>
       </w:r>
     </w:p>
     <w:p>
@@ -426,10 +514,35 @@
       <w:r>
         <w:rPr>
           <w:i/>
-          <w:color w:val="76647C"/>
+          <w:color w:val="776C7B"/>
           <w:sz w:val="18"/>
         </w:rPr>
-        <w:t>Visual: Show reported discovery, interpreted motivation and the proposed sharing feature as separate stages. Avoid invented view totals or social proof. S1.</w:t>
+        <w:t>Visual: Present the proposed customer job and the three benefits. This is a value hypothesis.</w:t>
+      </w:r>
+    </w:p>
+    <w:p>
+      <w:pPr>
+        <w:pStyle w:val="Heading2"/>
+      </w:pPr>
+      <w:r>
+        <w:t>2:05–2:20 | Slide 9: A shared memory. A personal object.</w:t>
+      </w:r>
+    </w:p>
+    <w:p>
+      <w:pPr/>
+      <w:r>
+        <w:t>The starting collection includes a pencil-case squishy, a gamepad squishy and cloud slime. Shared childhood themes connect the objects, while a small range of shapes keeps the proposed production manageable.</w:t>
+      </w:r>
+    </w:p>
+    <w:p>
+      <w:pPr/>
+      <w:r>
+        <w:rPr>
+          <w:i/>
+          <w:color w:val="776C7B"/>
+          <w:sz w:val="18"/>
+        </w:rPr>
+        <w:t>Visual: Show actual prototype artwork. The themes are proposed, not observed customer preferences. S2 supplies sensory-product context.</w:t>
       </w:r>
     </w:p>
     <w:p>
@@ -450,13 +563,13 @@
         <w:pStyle w:val="Heading2"/>
       </w:pPr>
       <w:r>
-        <w:t>2:05–2:25 | Slide 6: A familiar feeling. A chosen design.</w:t>
+        <w:t>2:20–2:35 | Slide 10: Four choices. One personal object.</w:t>
       </w:r>
     </w:p>
     <w:p>
       <w:pPr/>
       <w:r>
-        <w:t>Thairath describes slow rebound, scents and nostalgic interest. REPLAY LAB combines sensory choice with childhood themes: a pencil case, star sticker or old game controller. A small range of shared shapes keeps production manageable.</w:t>
+        <w:t>The studio has four steps: shape, colour, feel and story. Customers choose available options and add a name. Quiet and unscented settings suit a possible desk-use preference, subject to physical testing.</w:t>
       </w:r>
     </w:p>
     <w:p>
@@ -464,10 +577,10 @@
       <w:r>
         <w:rPr>
           <w:i/>
-          <w:color w:val="76647C"/>
+          <w:color w:val="776C7B"/>
           <w:sz w:val="18"/>
         </w:rPr>
-        <w:t>Visual: Show example original designs. These are proposed themes, not observed customer preferences. S2 supports the sensory product context.</w:t>
+        <w:t>Visual: Follow the four studio steps. Explain that real textures and scents need supplier-made samples.</w:t>
       </w:r>
     </w:p>
     <w:p>
@@ -475,13 +588,13 @@
         <w:pStyle w:val="Heading2"/>
       </w:pPr>
       <w:r>
-        <w:t>2:25–3:00 | Slide 7: Design it. Test demand. Make a batch.</w:t>
+        <w:t>2:35–3:00 | Slide 11: From a memory to a viable batch.</w:t>
       </w:r>
     </w:p>
     <w:p>
       <w:pPr/>
       <w:r>
-        <w:t>Here is the website demo. Choose squishy or slime, adjust colours and sensory options, then add a name and memory. Save the design or share its appearance. In the proposed business, selected themes become small collections. Pre-orders would open after supplier costs and samples are checked. Production begins only when the minimum batch is met; otherwise buyers receive refunds. This demo takes no payments.</w:t>
+        <w:t>Watch the ordering demo. Choose a shape, change its colour, name the design and save it. Add it to the bag, review the illustrative price, then confirm a simulated reservation. The notebook keeps the result. This is a prototype: no payment is taken and no product is ordered.</w:t>
       </w:r>
     </w:p>
     <w:p>
@@ -489,10 +602,10 @@
       <w:r>
         <w:rPr>
           <w:i/>
-          <w:color w:val="76647C"/>
+          <w:color w:val="776C7B"/>
           <w:sz w:val="18"/>
         </w:rPr>
-        <w:t>Visual: Show the actual studio screenshot or record the live designer while speaking. Demonstrate colour, save and share inside this segment; do not add a separate demo. Memory text is excluded from share links. Reservations are simulated.</w:t>
+        <w:t>Visual: Click the embedded MP4 in slideshow mode and narrate over its 25 seconds. This clip is already included in the timeline. If playback is unavailable, open the downloadable MP4 before recording. Do not add a second demo interval.</w:t>
       </w:r>
     </w:p>
     <w:p>
@@ -500,13 +613,13 @@
         <w:pStyle w:val="Heading2"/>
       </w:pPr>
       <w:r>
-        <w:t>3:00–3:20 | Slide 8: Make the difference specific.</w:t>
+        <w:t>3:00–3:15 | Slide 12: Personal meaning. Manageable production.</w:t>
       </w:r>
     </w:p>
     <w:p>
       <w:pPr/>
       <w:r>
-        <w:t>Custom squishies already exist. Our proposed difference combines shared Thai childhood memories, adult desk use and collections chosen with customers. Revenue comes from product sales. Shared shapes limit complexity while colours, names and memory cards add personal meaning.</w:t>
+        <w:t>Custom squishies already exist. Our proposed difference combines Thai childhood memories, adult use and customer-chosen collections. Shared shapes and supplier processes control complexity; colours, names and memory cards add personal meaning.</w:t>
       </w:r>
     </w:p>
     <w:p>
@@ -514,10 +627,98 @@
       <w:r>
         <w:rPr>
           <w:i/>
-          <w:color w:val="76647C"/>
+          <w:color w:val="776C7B"/>
           <w:sz w:val="18"/>
         </w:rPr>
-        <w:t>Visual: Show the shared-shape versus personal-detail diagram. Cite S5 for existing custom squishies; do not claim to be the first in the world.</w:t>
+        <w:t>Visual: Compare shared recipe and personal details. S5 demonstrates existing custom squishies; do not claim global novelty.</w:t>
+      </w:r>
+    </w:p>
+    <w:p>
+      <w:r>
+        <w:br w:type="page"/>
+      </w:r>
+    </w:p>
+    <w:p>
+      <w:pPr>
+        <w:pStyle w:val="Heading1"/>
+      </w:pPr>
+      <w:r>
+        <w:t>Find the opportunity</w:t>
+      </w:r>
+    </w:p>
+    <w:p>
+      <w:pPr>
+        <w:pStyle w:val="Heading2"/>
+      </w:pPr>
+      <w:r>
+        <w:t>3:15–3:30 | Slide 13: Sell the object. Keep the options focused.</w:t>
+      </w:r>
+    </w:p>
+    <w:p>
+      <w:pPr/>
+      <w:r>
+        <w:t>Revenue would come from product sales and selected upgrades. The demo starts squishies at three hundred forty-nine baht and slime at two hundred ninety-nine. These are illustrative prices, not validated offers.</w:t>
+      </w:r>
+    </w:p>
+    <w:p>
+      <w:pPr/>
+      <w:r>
+        <w:rPr>
+          <w:i/>
+          <w:color w:val="776C7B"/>
+          <w:sz w:val="18"/>
+        </w:rPr>
+        <w:t>Visual: Present sample catalogue prices and optional upgrades as assumptions. Actual delivery costs and product terms remain unconfirmed.</w:t>
+      </w:r>
+    </w:p>
+    <w:p>
+      <w:pPr>
+        <w:pStyle w:val="Heading2"/>
+      </w:pPr>
+      <w:r>
+        <w:t>3:30–3:50 | Slide 14: Three risks. Three practical tests.</w:t>
+      </w:r>
+    </w:p>
+    <w:p>
+      <w:pPr/>
+      <w:r>
+        <w:t>Three risks need tests: customers may prefer a cheaper toy, custom options can complicate production, and nostalgia may drive only one purchase. Compare prototype preferences, check supplier samples and explore repeat-use reasons. Product information also needs checking, as the OCPB report illustrates.</w:t>
+      </w:r>
+    </w:p>
+    <w:p>
+      <w:pPr/>
+      <w:r>
+        <w:rPr>
+          <w:i/>
+          <w:color w:val="776C7B"/>
+          <w:sz w:val="18"/>
+        </w:rPr>
+        <w:t>Visual: Use the risk/test/result table. S4 reports incomplete labels at some sellers; avoid generalising to all toys.</w:t>
+      </w:r>
+    </w:p>
+    <w:p>
+      <w:pPr>
+        <w:pStyle w:val="Heading2"/>
+      </w:pPr>
+      <w:r>
+        <w:t>3:50–4:15 | Slide 15: Make the batch pay for itself.</w:t>
+      </w:r>
+    </w:p>
+    <w:p>
+      <w:pPr/>
+      <w:r>
+        <w:t>The economics are assumptions. Three hundred forty-nine baht minus one hundred ninety-nine leaves one hundred fifty per unit. Four thousand five hundred in setup costs therefore requires thirty units. The actual threshold must also meet supplier minimums and include every relevant cost.</w:t>
+      </w:r>
+    </w:p>
+    <w:p>
+      <w:pPr/>
+      <w:r>
+        <w:rPr>
+          <w:i/>
+          <w:color w:val="776C7B"/>
+          <w:sz w:val="18"/>
+        </w:rPr>
+        <w:t>Visual: Follow the proportional price bar, then the setup/contribution calculation. All numbers require real quotes and demand validation.</w:t>
       </w:r>
     </w:p>
     <w:p>
@@ -538,13 +739,13 @@
         <w:pStyle w:val="Heading2"/>
       </w:pPr>
       <w:r>
-        <w:t>3:20–3:55 | Slide 9: Three risks need an answer.</w:t>
+        <w:t>4:15–4:30 | Slide 16: Ask. Observe. Then commit.</w:t>
       </w:r>
     </w:p>
     <w:p>
       <w:pPr/>
       <w:r>
-        <w:t>Three risks matter. Customers may prefer a cheaper ready-made toy. Custom options can increase mistakes, delays and costs. Nostalgia may also prompt only one purchase. Quality needs attention: the consumer protection office reported incomplete labels at some Mega Plaza sellers in June. Before real orders, the business needs approved samples, clear product information, realistic delivery dates and workable refunds.</w:t>
+        <w:t>First, interview actual buyers. Then show the concept and prototype at a viable price. Finally, confirm supplier quality, costs and terms before a real purchase test. Survey interest alone is insufficient.</w:t>
       </w:r>
     </w:p>
     <w:p>
@@ -552,10 +753,10 @@
       <w:r>
         <w:rPr>
           <w:i/>
-          <w:color w:val="76647C"/>
+          <w:color w:val="776C7B"/>
           <w:sz w:val="18"/>
         </w:rPr>
-        <w:t>Visual: Use the three decision rows plus the specific OCPB example. S4 concerns some sellers, not all products.</w:t>
+        <w:t>Visual: Show the sequence of behaviour research, concept testing and supplier/purchase validation. Keep demo clicks separate from fieldwork.</w:t>
       </w:r>
     </w:p>
     <w:p>
@@ -563,13 +764,13 @@
         <w:pStyle w:val="Heading2"/>
       </w:pPr>
       <w:r>
-        <w:t>3:55–4:25 | Slide 10: Orders must cover a real batch.</w:t>
+        <w:t>4:30–4:45 | Slide 17: Start small. Earn the next batch.</w:t>
       </w:r>
     </w:p>
     <w:p>
       <w:pPr/>
       <w:r>
-        <w:t>The numbers on this slide are assumptions. At a price of three hundred forty-nine baht and variable cost of one hundred ninety-nine, contribution is one hundred fifty baht. A setup cost of four thousand five hundred requires thirty units. The actual threshold must also meet the supplier’s minimum quantity. Include all costs and test willingness to pay before production.</w:t>
+        <w:t>Start with one collection. Continue only when people prefer it at a viable price, quality is consistent, and orders cover the batch. Let weak results change the idea.</w:t>
       </w:r>
     </w:p>
     <w:p>
@@ -577,10 +778,10 @@
       <w:r>
         <w:rPr>
           <w:i/>
-          <w:color w:val="76647C"/>
+          <w:color w:val="776C7B"/>
           <w:sz w:val="18"/>
         </w:rPr>
-        <w:t>Visual: Show the threshold formula and distinguish demo activity from evidence. Do not present the demo counter as market demand.</w:t>
+        <w:t>Visual: End with three pilot gates and the clickable prototype link.</w:t>
       </w:r>
     </w:p>
     <w:p>
@@ -588,13 +789,7 @@
         <w:pStyle w:val="Heading2"/>
       </w:pPr>
       <w:r>
-        <w:t>4:25–4:45 | Slide 11: Start with one collection.</w:t>
-      </w:r>
-    </w:p>
-    <w:p>
-      <w:pPr/>
-      <w:r>
-        <w:t>Start with one collection. Continue only if working adults prefer the concept at a viable price, the supplier delivers consistent quality, and the batch covers its costs. Use the questionnaire to find weaknesses as carefully as enthusiasm.</w:t>
+        <w:t>4:45–4:50 | Slide 18: Sources &amp; prototype</w:t>
       </w:r>
     </w:p>
     <w:p>
@@ -602,29 +797,10 @@
       <w:r>
         <w:rPr>
           <w:i/>
-          <w:color w:val="76647C"/>
+          <w:color w:val="776C7B"/>
           <w:sz w:val="18"/>
         </w:rPr>
-        <w:t>Visual: Close on the three pilot gates. If demonstrating the website live, include that time inside the five-minute limit.</w:t>
-      </w:r>
-    </w:p>
-    <w:p>
-      <w:pPr>
-        <w:pStyle w:val="Heading2"/>
-      </w:pPr>
-      <w:r>
-        <w:t>4:45–4:50 | Slide 12: Sources and demo</w:t>
-      </w:r>
-    </w:p>
-    <w:p>
-      <w:pPr/>
-      <w:r>
-        <w:rPr>
-          <w:i/>
-          <w:color w:val="76647C"/>
-          <w:sz w:val="18"/>
-        </w:rPr>
-        <w:t>Visual: Silent source card. Slide 13 is a hidden canvas appendix and is outside the video runtime.</w:t>
+        <w:t>Visual: Silent five-second source card. All eighteen slides are part of the presentation; full source notes accompany the files.</w:t>
       </w:r>
     </w:p>
     <w:p>
@@ -651,7 +827,7 @@
       <w:r>
         <w:rPr>
           <w:i/>
-          <w:color w:val="76647C"/>
+          <w:color w:val="776C7B"/>
           <w:sz w:val="18"/>
         </w:rPr>
         <w:t>Use only counts and quotations you actually collected. Keep the replacement near 40 words. If adult buyers do not report nostalgia or social discovery, say so and adjust the explanation. Label any translated quote accurately.</w:t>
@@ -1196,7 +1372,7 @@
       <w:rFonts w:asciiTheme="majorHAnsi" w:eastAsiaTheme="majorEastAsia" w:hAnsiTheme="majorHAnsi" w:cstheme="majorBidi" w:ascii="Arial" w:hAnsi="Arial"/>
       <w:b/>
       <w:bCs/>
-      <w:color w:val="57445E"/>
+      <w:color w:val="392C42"/>
       <w:sz w:val="40"/>
       <w:szCs w:val="28"/>
     </w:rPr>
@@ -1220,7 +1396,7 @@
       <w:rFonts w:asciiTheme="majorHAnsi" w:eastAsiaTheme="majorEastAsia" w:hAnsiTheme="majorHAnsi" w:cstheme="majorBidi" w:ascii="Arial" w:hAnsi="Arial"/>
       <w:b/>
       <w:bCs/>
-      <w:color w:val="57445E"/>
+      <w:color w:val="392C42"/>
       <w:sz w:val="28"/>
       <w:szCs w:val="26"/>
     </w:rPr>
@@ -1244,7 +1420,7 @@
       <w:rFonts w:asciiTheme="majorHAnsi" w:eastAsiaTheme="majorEastAsia" w:hAnsiTheme="majorHAnsi" w:cstheme="majorBidi" w:ascii="Arial" w:hAnsi="Arial"/>
       <w:b/>
       <w:bCs/>
-      <w:color w:val="57445E"/>
+      <w:color w:val="392C42"/>
       <w:sz w:val="22"/>
     </w:rPr>
   </w:style>
@@ -1484,7 +1660,7 @@
     </w:pPr>
     <w:rPr>
       <w:rFonts w:asciiTheme="majorHAnsi" w:eastAsiaTheme="majorEastAsia" w:hAnsiTheme="majorHAnsi" w:cstheme="majorBidi" w:ascii="Arial" w:hAnsi="Arial"/>
-      <w:color w:val="57445E"/>
+      <w:color w:val="392C42"/>
       <w:spacing w:val="5"/>
       <w:kern w:val="28"/>
       <w:sz w:val="56"/>

</xml_diff>

<commit_message>
Expand English narration to eight minutes with slide-by-slide scripts
</commit_message>
<xml_diff>
--- a/downloads/REPLAY_LAB_Script.docx
+++ b/downloads/REPLAY_LAB_Script.docx
@@ -18,7 +18,7 @@
           <w:color w:val="776C7B"/>
           <w:sz w:val="18"/>
         </w:rPr>
-        <w:t>Childhood, remade. / English speaking script / five-minute video</w:t>
+        <w:t>English presentation script / 18 slides / approximately 8 minutes</w:t>
       </w:r>
     </w:p>
     <w:p>
@@ -26,13 +26,13 @@
         <w:pStyle w:val="Heading1"/>
       </w:pPr>
       <w:r>
-        <w:t>Recording plan</w:t>
+        <w:t>How to use this script</w:t>
       </w:r>
     </w:p>
     <w:p>
       <w:pPr/>
       <w:r>
-        <w:t>561 spoken words. Slides 1–17 cover the story; slide 18 is a silent five-second source card. Slide 11 includes a 25-second recorded website demo. Speak its narration over the clip; do not add the clip as extra time. The target is 4 minutes 50 seconds including the demo and credits, leaving 10 seconds below the limit. Speak at about 120 words per minute; actual recording length must be checked. Record a rehearsal after inserting your own evidence.</w:t>
+        <w:t>1,112 spoken words across 18 slides. Each slide has its own page: read only the text under SAY THIS. The slide title, timing and presenter cues are not spoken. This expanded edition replaces the earlier five-minute version.</w:t>
       </w:r>
     </w:p>
     <w:p>
@@ -40,13 +40,19 @@
         <w:pStyle w:val="Heading2"/>
       </w:pPr>
       <w:r>
-        <w:t>Tone and audience</w:t>
+        <w:t>Timing and delivery</w:t>
       </w:r>
     </w:p>
     <w:p>
       <w:pPr/>
       <w:r>
-        <w:t>Speak directly and confidently to a marketing instructor and classmates. Explain the source, then your interpretation, then the business decision. Keep the playful visual style separate from the seriousness of the evidence. Do not read URLs aloud.</w:t>
+        <w:t>The planned timeline is 8:00, including the 25-second website demo and the closing source slide. Aim for about 140–150 words per minute, with brief pauses between ideas. The time labels are rehearsal targets, not guaranteed recording duration. Rehearse once and adjust your pace naturally.</w:t>
+      </w:r>
+    </w:p>
+    <w:p>
+      <w:pPr/>
+      <w:r>
+        <w:t>On slide 11, introduce the clip for about 7 seconds, play the 25-second video while reading the middle paragraph, then spend about 8 seconds on the final paragraph. Its full 40-second slot already includes the clip. The video is silent and contains English on-screen instructions.</w:t>
       </w:r>
     </w:p>
     <w:p>
@@ -54,13 +60,13 @@
         <w:pStyle w:val="Heading2"/>
       </w:pPr>
       <w:r>
-        <w:t>What still needs real evidence</w:t>
+        <w:t>Evidence status</w:t>
       </w:r>
     </w:p>
     <w:p>
       <w:pPr/>
       <w:r>
-        <w:t>Slide 4 is an honest pre-fieldwork version. Replace it with your own dated observations or interviews before submission. Demo votes, saved designs, simulated reservations are not real consumer research. The questionnaire helps collect evidence; blank forms are not findings.</w:t>
+        <w:t>Slide 4 explains that original fieldwork is pending. Replace its narration with your own verified observations or interviews when available, keeping roughly 60 words. Do not read the sample replacement template as a finding. Demo votes and reservations are simulations, not consumer research.</w:t>
       </w:r>
     </w:p>
     <w:tbl>
@@ -113,7 +119,7 @@
           </w:tcPr>
           <w:p>
             <w:r>
-              <w:t>0:00–0:55</w:t>
+              <w:t>0:00–1:35</w:t>
             </w:r>
           </w:p>
         </w:tc>
@@ -133,7 +139,7 @@
           </w:tcPr>
           <w:p>
             <w:r>
-              <w:t>Reported change + original evidence</w:t>
+              <w:t>Opening, reported signal and evidence limits</w:t>
             </w:r>
           </w:p>
         </w:tc>
@@ -145,7 +151,7 @@
           </w:tcPr>
           <w:p>
             <w:r>
-              <w:t>0:55–1:50</w:t>
+              <w:t>1:35–3:00</w:t>
             </w:r>
           </w:p>
         </w:tc>
@@ -165,7 +171,7 @@
           </w:tcPr>
           <w:p>
             <w:r>
-              <w:t>Audience + two class concepts</w:t>
+              <w:t>Target customer and consumer behaviour</w:t>
             </w:r>
           </w:p>
         </w:tc>
@@ -177,7 +183,7 @@
           </w:tcPr>
           <w:p>
             <w:r>
-              <w:t>1:50–3:30</w:t>
+              <w:t>3:00–5:45</w:t>
             </w:r>
           </w:p>
         </w:tc>
@@ -197,7 +203,7 @@
           </w:tcPr>
           <w:p>
             <w:r>
-              <w:t>Opportunity + design + recorded demo + revenue</w:t>
+              <w:t>Value, products, design, demo and revenue</w:t>
             </w:r>
           </w:p>
         </w:tc>
@@ -209,7 +215,7 @@
           </w:tcPr>
           <w:p>
             <w:r>
-              <w:t>3:30–4:45</w:t>
+              <w:t>5:45–7:50</w:t>
             </w:r>
           </w:p>
         </w:tc>
@@ -229,7 +235,7 @@
           </w:tcPr>
           <w:p>
             <w:r>
-              <w:t>Risk, economics, validation and decision</w:t>
+              <w:t>Risks, economics, validation and recommendation</w:t>
             </w:r>
           </w:p>
         </w:tc>
@@ -241,7 +247,7 @@
           </w:tcPr>
           <w:p>
             <w:r>
-              <w:t>4:45–4:50</w:t>
+              <w:t>7:50–8:00</w:t>
             </w:r>
           </w:p>
         </w:tc>
@@ -261,24 +267,67 @@
           </w:tcPr>
           <w:p>
             <w:r>
-              <w:t>Source card</w:t>
+              <w:t>Sources and spoken closing</w:t>
             </w:r>
           </w:p>
         </w:tc>
       </w:tr>
     </w:tbl>
     <w:p>
+      <w:r>
+        <w:br w:type="page"/>
+      </w:r>
+    </w:p>
+    <w:p>
       <w:pPr>
-        <w:pStyle w:val="Heading2"/>
+        <w:pStyle w:val="Heading1"/>
       </w:pPr>
       <w:r>
-        <w:t>PowerPoint font</w:t>
+        <w:t>SLIDE 01 / Good memories. Made tangible.</w:t>
       </w:r>
     </w:p>
     <w:p>
       <w:pPr/>
       <w:r>
-        <w:t>The included Press Start 2P font is used for small labels. Headlines and body text use Arial for reliable editing. Install assets/pixel.ttf before editing the PPTX if the font is missing. PDF and PNG versions preserve the design. Body text is Arial for readability.</w:t>
+        <w:rPr>
+          <w:i/>
+          <w:color w:val="776C7B"/>
+          <w:sz w:val="18"/>
+        </w:rPr>
+        <w:t>0:00–0:20 | 20 seconds | 46 spoken words</w:t>
+      </w:r>
+    </w:p>
+    <w:p>
+      <w:pPr>
+        <w:pStyle w:val="Heading2"/>
+      </w:pPr>
+      <w:r>
+        <w:t>SAY THIS</w:t>
+      </w:r>
+    </w:p>
+    <w:p>
+      <w:pPr/>
+      <w:r>
+        <w:t>Hello everyone. Think about a toy you wanted as a child but never bought. What would it mean to buy it today, with your own money? That question is the starting point for REPLAY LAB: a proposed business connecting childhood memories with personalised squishies and slime.</w:t>
+      </w:r>
+    </w:p>
+    <w:p>
+      <w:pPr>
+        <w:pStyle w:val="Heading2"/>
+      </w:pPr>
+      <w:r>
+        <w:t>PRESENTER CUE — do not read aloud</w:t>
+      </w:r>
+    </w:p>
+    <w:p>
+      <w:pPr/>
+      <w:r>
+        <w:rPr>
+          <w:i/>
+          <w:color w:val="776C7B"/>
+          <w:sz w:val="18"/>
+        </w:rPr>
+        <w:t>Open on the original product artwork and brand promise. It is concept art, not fieldwork.</w:t>
       </w:r>
     </w:p>
     <w:p>
@@ -291,21 +340,7 @@
         <w:pStyle w:val="Heading1"/>
       </w:pPr>
       <w:r>
-        <w:t>Spot the change</w:t>
-      </w:r>
-    </w:p>
-    <w:p>
-      <w:pPr>
-        <w:pStyle w:val="Heading2"/>
-      </w:pPr>
-      <w:r>
-        <w:t>0:00–0:10 | Slide 1: Good memories. Made tangible.</w:t>
-      </w:r>
-    </w:p>
-    <w:p>
-      <w:pPr/>
-      <w:r>
-        <w:t>A toy can carry a memory. REPLAY LAB explores how working adults might turn childhood wishes into personal squishies and slime.</w:t>
+        <w:t>SLIDE 02 / A revival worth investigating.</w:t>
       </w:r>
     </w:p>
     <w:p>
@@ -316,7 +351,7 @@
           <w:color w:val="776C7B"/>
           <w:sz w:val="18"/>
         </w:rPr>
-        <w:t>Visual: Open on the original product artwork and brand promise. It is concept art, not fieldwork.</w:t>
+        <w:t>0:20–0:45 | 25 seconds | 61 spoken words</w:t>
       </w:r>
     </w:p>
     <w:p>
@@ -324,13 +359,21 @@
         <w:pStyle w:val="Heading2"/>
       </w:pPr>
       <w:r>
-        <w:t>0:10–0:25 | Slide 2: A revival worth investigating.</w:t>
+        <w:t>SAY THIS</w:t>
       </w:r>
     </w:p>
     <w:p>
       <w:pPr/>
       <w:r>
-        <w:t>Thai PBS World reported a toy revival at Sampheng in June twenty twenty-six. Thairath reported a broader revival at Mega Plaza. These are local signals, not a market-size estimate.</w:t>
+        <w:t>First, let us look at the signal behind this idea. Thai PBS World reported renewed interest in squishies and slime at Sampheng in June twenty twenty-six. Thairath also covered a revival at Mega Plaza. These reports give us a reason to investigate. However, they describe particular places and moments, rather than proving the size or future growth of the whole market.</w:t>
+      </w:r>
+    </w:p>
+    <w:p>
+      <w:pPr>
+        <w:pStyle w:val="Heading2"/>
+      </w:pPr>
+      <w:r>
+        <w:t>PRESENTER CUE — do not read aloud</w:t>
       </w:r>
     </w:p>
     <w:p>
@@ -341,32 +384,7 @@
           <w:color w:val="776C7B"/>
           <w:sz w:val="18"/>
         </w:rPr>
-        <w:t>Visual: Compare the two dated sources. S1 supports the reported adult-return account; S2 supports the broader sensory-toy revival.</w:t>
-      </w:r>
-    </w:p>
-    <w:p>
-      <w:pPr>
-        <w:pStyle w:val="Heading2"/>
-      </w:pPr>
-      <w:r>
-        <w:t>0:25–0:40 | Slide 3: The toy is familiar. The buyer’s situation has changed.</w:t>
-      </w:r>
-    </w:p>
-    <w:p>
-      <w:pPr/>
-      <w:r>
-        <w:t>The Sampheng vendor described working adults buying toys they had wanted but could not afford as children. The product is familiar; adult income changes the buyer’s freedom to choose.</w:t>
-      </w:r>
-    </w:p>
-    <w:p>
-      <w:pPr/>
-      <w:r>
-        <w:rPr>
-          <w:i/>
-          <w:color w:val="776C7B"/>
-          <w:sz w:val="18"/>
-        </w:rPr>
-        <w:t>Visual: Show the before/after buying context. These are analytical labels, not participant quotations. Cite S1.</w:t>
+        <w:t>Compare the two dated sources. S1 supports the reported adult-return account; S2 supports the broader sensory-toy revival.</w:t>
       </w:r>
     </w:p>
     <w:p>
@@ -379,21 +397,7 @@
         <w:pStyle w:val="Heading1"/>
       </w:pPr>
       <w:r>
-        <w:t>Spot the change</w:t>
-      </w:r>
-    </w:p>
-    <w:p>
-      <w:pPr>
-        <w:pStyle w:val="Heading2"/>
-      </w:pPr>
-      <w:r>
-        <w:t>0:40–0:55 | Slide 4: A promising signal. An evidence gap to close.</w:t>
-      </w:r>
-    </w:p>
-    <w:p>
-      <w:pPr/>
-      <w:r>
-        <w:t>Original fieldwork is still pending. Mega Plaza’s observed buyers were mainly children and teenagers. I need direct evidence from working adults, asking about actual purchases before showing the business idea.</w:t>
+        <w:t>SLIDE 03 / The toy is familiar. The buyer’s situation has changed.</w:t>
       </w:r>
     </w:p>
     <w:p>
@@ -404,7 +408,7 @@
           <w:color w:val="776C7B"/>
           <w:sz w:val="18"/>
         </w:rPr>
-        <w:t>Visual: Replace this plan with actual dated observations, buyer counts and one consented quote before submission. Published news is not personal fieldwork.</w:t>
+        <w:t>0:45–1:10 | 25 seconds | 59 spoken words</w:t>
       </w:r>
     </w:p>
     <w:p>
@@ -412,13 +416,21 @@
         <w:pStyle w:val="Heading2"/>
       </w:pPr>
       <w:r>
-        <w:t>0:55–1:10 | Slide 5: Design for a specific buyer.</w:t>
+        <w:t>SAY THIS</w:t>
       </w:r>
     </w:p>
     <w:p>
       <w:pPr/>
       <w:r>
-        <w:t>The proposed target is early-career Thai adults buying for their own enjoyment or collection. A desk, display or everyday break provides a possible use context. These preferences still need testing.</w:t>
+        <w:t>The interesting change is not simply that toys are popular again. It is that some buyers now have a different relationship with them. The Sampheng report includes a vendor’s account of working adults buying toys they wanted when they were younger. A childhood wish that once depended on their parents can now become a purchase they choose for themselves.</w:t>
+      </w:r>
+    </w:p>
+    <w:p>
+      <w:pPr>
+        <w:pStyle w:val="Heading2"/>
+      </w:pPr>
+      <w:r>
+        <w:t>PRESENTER CUE — do not read aloud</w:t>
       </w:r>
     </w:p>
     <w:p>
@@ -429,32 +441,7 @@
           <w:color w:val="776C7B"/>
           <w:sz w:val="18"/>
         </w:rPr>
-        <w:t>Visual: Identify the proposed target and use context. Do not describe this as a researched persona.</w:t>
-      </w:r>
-    </w:p>
-    <w:p>
-      <w:pPr>
-        <w:pStyle w:val="Heading2"/>
-      </w:pPr>
-      <w:r>
-        <w:t>1:10–1:30 | Slide 6: Memory can change what a toy is worth.</w:t>
-      </w:r>
-    </w:p>
-    <w:p>
-      <w:pPr/>
-      <w:r>
-        <w:t>Emotional motivation explains why a familiar object may matter. Memory adds personal meaning, texture offers enjoyment, and adult income enables choice. My interpretation is that these benefits can combine. Whether buyers would pay more remains an open question.</w:t>
-      </w:r>
-    </w:p>
-    <w:p>
-      <w:pPr/>
-      <w:r>
-        <w:rPr>
-          <w:i/>
-          <w:color w:val="776C7B"/>
-          <w:sz w:val="18"/>
-        </w:rPr>
-        <w:t>Visual: Explain memory, enjoyment and choice as an interpretation to test. No medical benefit or price premium is established.</w:t>
+        <w:t>Show the before/after buying context. These are analytical labels, not participant quotations. Cite S1.</w:t>
       </w:r>
     </w:p>
     <w:p>
@@ -467,21 +454,7 @@
         <w:pStyle w:val="Heading1"/>
       </w:pPr>
       <w:r>
-        <w:t>Explain the consumer</w:t>
-      </w:r>
-    </w:p>
-    <w:p>
-      <w:pPr>
-        <w:pStyle w:val="Heading2"/>
-      </w:pPr>
-      <w:r>
-        <w:t>1:30–1:50 | Slide 7: Discovery gets attention. Meaning may explain the purchase.</w:t>
-      </w:r>
-    </w:p>
-    <w:p>
-      <w:pPr/>
-      <w:r>
-        <w:t>Social influence helps explain rediscovery. Reviews bring toys back into view, and seeing other adults play may make buying feel acceptable. Discovery and motivation differ: a review may attract attention while memory explains the choice. Paid demand still needs testing.</w:t>
+        <w:t>SLIDE 04 / A promising signal. An evidence gap to close.</w:t>
       </w:r>
     </w:p>
     <w:p>
@@ -492,7 +465,7 @@
           <w:color w:val="776C7B"/>
           <w:sz w:val="18"/>
         </w:rPr>
-        <w:t>Visual: Follow reported discovery, interpreted relevance and a real choice still to test. S1 supports the first stage.</w:t>
+        <w:t>1:10–1:35 | 25 seconds | 62 spoken words</w:t>
       </w:r>
     </w:p>
     <w:p>
@@ -500,13 +473,21 @@
         <w:pStyle w:val="Heading2"/>
       </w:pPr>
       <w:r>
-        <w:t>1:50–2:05 | Slide 8: Bring a familiar memory into my everyday life.</w:t>
+        <w:t>SAY THIS</w:t>
       </w:r>
     </w:p>
     <w:p>
       <w:pPr/>
       <w:r>
-        <w:t>Our proposed value is simple: bring a familiar memory into everyday life. Customers get a recognisable theme, personal design choices and clear product information. This is a hypothesis to test.</w:t>
+        <w:t>Before explaining the business, I want to separate published evidence from my own research. Original fieldwork is still pending, and the Mega Plaza report mainly observed children and teenagers. It does not independently confirm adult demand. My next step is to interview working adults about their actual purchases, before showing them REPLAY LAB, so the concept does not shape their initial answers.</w:t>
+      </w:r>
+    </w:p>
+    <w:p>
+      <w:pPr>
+        <w:pStyle w:val="Heading2"/>
+      </w:pPr>
+      <w:r>
+        <w:t>PRESENTER CUE — do not read aloud</w:t>
       </w:r>
     </w:p>
     <w:p>
@@ -517,32 +498,7 @@
           <w:color w:val="776C7B"/>
           <w:sz w:val="18"/>
         </w:rPr>
-        <w:t>Visual: Present the proposed customer job and the three benefits. This is a value hypothesis.</w:t>
-      </w:r>
-    </w:p>
-    <w:p>
-      <w:pPr>
-        <w:pStyle w:val="Heading2"/>
-      </w:pPr>
-      <w:r>
-        <w:t>2:05–2:20 | Slide 9: A shared memory. A personal object.</w:t>
-      </w:r>
-    </w:p>
-    <w:p>
-      <w:pPr/>
-      <w:r>
-        <w:t>The starting collection includes a pencil-case squishy, a gamepad squishy and cloud slime. Shared childhood themes connect the objects, while a small range of shapes keeps the proposed production manageable.</w:t>
-      </w:r>
-    </w:p>
-    <w:p>
-      <w:pPr/>
-      <w:r>
-        <w:rPr>
-          <w:i/>
-          <w:color w:val="776C7B"/>
-          <w:sz w:val="18"/>
-        </w:rPr>
-        <w:t>Visual: Show actual prototype artwork. The themes are proposed, not observed customer preferences. S2 supplies sensory-product context.</w:t>
+        <w:t>Replace this plan with actual dated observations, buyer counts and one consented quote before submission. Published news is not personal fieldwork.</w:t>
       </w:r>
     </w:p>
     <w:p>
@@ -555,21 +511,7 @@
         <w:pStyle w:val="Heading1"/>
       </w:pPr>
       <w:r>
-        <w:t>Find the opportunity</w:t>
-      </w:r>
-    </w:p>
-    <w:p>
-      <w:pPr>
-        <w:pStyle w:val="Heading2"/>
-      </w:pPr>
-      <w:r>
-        <w:t>2:20–2:35 | Slide 10: Four choices. One personal object.</w:t>
-      </w:r>
-    </w:p>
-    <w:p>
-      <w:pPr/>
-      <w:r>
-        <w:t>The studio has four steps: shape, colour, feel and story. Customers choose available options and add a name. Quiet and unscented settings suit a possible desk-use preference, subject to physical testing.</w:t>
+        <w:t>SLIDE 05 / Design for a specific buyer.</w:t>
       </w:r>
     </w:p>
     <w:p>
@@ -580,7 +522,7 @@
           <w:color w:val="776C7B"/>
           <w:sz w:val="18"/>
         </w:rPr>
-        <w:t>Visual: Follow the four studio steps. Explain that real textures and scents need supplier-made samples.</w:t>
+        <w:t>1:35–2:00 | 25 seconds | 61 spoken words</w:t>
       </w:r>
     </w:p>
     <w:p>
@@ -588,13 +530,21 @@
         <w:pStyle w:val="Heading2"/>
       </w:pPr>
       <w:r>
-        <w:t>2:35–3:00 | Slide 11: From a memory to a viable batch.</w:t>
+        <w:t>SAY THIS</w:t>
       </w:r>
     </w:p>
     <w:p>
       <w:pPr/>
       <w:r>
-        <w:t>Watch the ordering demo. Choose a shape, change its colour, name the design and save it. Add it to the bag, review the illustrative price, then confirm a simulated reservation. The notebook keeps the result. This is a prototype: no payment is taken and no product is ordered.</w:t>
+        <w:t>Based on that signal, my proposed target is early-career Thai adults who buy toys for themselves, rather than for children. They might keep a small object on a desk, display it at home, or enjoy using it during a break. These are possible use situations to test. The key question is which memories and product features matter to this specific group.</w:t>
+      </w:r>
+    </w:p>
+    <w:p>
+      <w:pPr>
+        <w:pStyle w:val="Heading2"/>
+      </w:pPr>
+      <w:r>
+        <w:t>PRESENTER CUE — do not read aloud</w:t>
       </w:r>
     </w:p>
     <w:p>
@@ -605,32 +555,7 @@
           <w:color w:val="776C7B"/>
           <w:sz w:val="18"/>
         </w:rPr>
-        <w:t>Visual: Click the embedded MP4 in slideshow mode and narrate over its 25 seconds. This clip is already included in the timeline. If playback is unavailable, open the downloadable MP4 before recording. Do not add a second demo interval.</w:t>
-      </w:r>
-    </w:p>
-    <w:p>
-      <w:pPr>
-        <w:pStyle w:val="Heading2"/>
-      </w:pPr>
-      <w:r>
-        <w:t>3:00–3:15 | Slide 12: Personal meaning. Manageable production.</w:t>
-      </w:r>
-    </w:p>
-    <w:p>
-      <w:pPr/>
-      <w:r>
-        <w:t>Custom squishies already exist. Our proposed difference combines Thai childhood memories, adult use and customer-chosen collections. Shared shapes and supplier processes control complexity; colours, names and memory cards add personal meaning.</w:t>
-      </w:r>
-    </w:p>
-    <w:p>
-      <w:pPr/>
-      <w:r>
-        <w:rPr>
-          <w:i/>
-          <w:color w:val="776C7B"/>
-          <w:sz w:val="18"/>
-        </w:rPr>
-        <w:t>Visual: Compare shared recipe and personal details. S5 demonstrates existing custom squishies; do not claim global novelty.</w:t>
+        <w:t>Identify the proposed target and use context. Do not describe this as a researched persona.</w:t>
       </w:r>
     </w:p>
     <w:p>
@@ -643,21 +568,7 @@
         <w:pStyle w:val="Heading1"/>
       </w:pPr>
       <w:r>
-        <w:t>Find the opportunity</w:t>
-      </w:r>
-    </w:p>
-    <w:p>
-      <w:pPr>
-        <w:pStyle w:val="Heading2"/>
-      </w:pPr>
-      <w:r>
-        <w:t>3:15–3:30 | Slide 13: Sell the object. Keep the options focused.</w:t>
-      </w:r>
-    </w:p>
-    <w:p>
-      <w:pPr/>
-      <w:r>
-        <w:t>Revenue would come from product sales and selected upgrades. The demo starts squishies at three hundred forty-nine baht and slime at two hundred ninety-nine. These are illustrative prices, not validated offers.</w:t>
+        <w:t>SLIDE 06 / Memory can change what a toy is worth.</w:t>
       </w:r>
     </w:p>
     <w:p>
@@ -668,7 +579,7 @@
           <w:color w:val="776C7B"/>
           <w:sz w:val="18"/>
         </w:rPr>
-        <w:t>Visual: Present sample catalogue prices and optional upgrades as assumptions. Actual delivery costs and product terms remain unconfirmed.</w:t>
+        <w:t>2:00–2:30 | 30 seconds | 66 spoken words</w:t>
       </w:r>
     </w:p>
     <w:p>
@@ -676,13 +587,21 @@
         <w:pStyle w:val="Heading2"/>
       </w:pPr>
       <w:r>
-        <w:t>3:30–3:50 | Slide 14: Three risks. Three practical tests.</w:t>
+        <w:t>SAY THIS</w:t>
       </w:r>
     </w:p>
     <w:p>
       <w:pPr/>
       <w:r>
-        <w:t>Three risks need tests: customers may prefer a cheaper toy, custom options can complicate production, and nostalgia may drive only one purchase. Compare prototype preferences, check supplier samples and explore repeat-use reasons. Product information also needs checking, as the OCPB report illustrates.</w:t>
+        <w:t>The first consumer behaviour concept is emotional motivation. A familiar shape may remind someone of an after-school routine or a game they enjoyed. The texture may also be enjoyable on its own. Adult income then gives that person more freedom to choose. My interpretation is that memory, enjoyment and choice could work together. However, emotional meaning does not automatically mean customers will pay a higher price.</w:t>
+      </w:r>
+    </w:p>
+    <w:p>
+      <w:pPr>
+        <w:pStyle w:val="Heading2"/>
+      </w:pPr>
+      <w:r>
+        <w:t>PRESENTER CUE — do not read aloud</w:t>
       </w:r>
     </w:p>
     <w:p>
@@ -693,32 +612,7 @@
           <w:color w:val="776C7B"/>
           <w:sz w:val="18"/>
         </w:rPr>
-        <w:t>Visual: Use the risk/test/result table. S4 reports incomplete labels at some sellers; avoid generalising to all toys.</w:t>
-      </w:r>
-    </w:p>
-    <w:p>
-      <w:pPr>
-        <w:pStyle w:val="Heading2"/>
-      </w:pPr>
-      <w:r>
-        <w:t>3:50–4:15 | Slide 15: Make the batch pay for itself.</w:t>
-      </w:r>
-    </w:p>
-    <w:p>
-      <w:pPr/>
-      <w:r>
-        <w:t>The economics are assumptions. Three hundred forty-nine baht minus one hundred ninety-nine leaves one hundred fifty per unit. Four thousand five hundred in setup costs therefore requires thirty units. The actual threshold must also meet supplier minimums and include every relevant cost.</w:t>
-      </w:r>
-    </w:p>
-    <w:p>
-      <w:pPr/>
-      <w:r>
-        <w:rPr>
-          <w:i/>
-          <w:color w:val="776C7B"/>
-          <w:sz w:val="18"/>
-        </w:rPr>
-        <w:t>Visual: Follow the proportional price bar, then the setup/contribution calculation. All numbers require real quotes and demand validation.</w:t>
+        <w:t>Explain memory, enjoyment and choice as an interpretation to test. No medical benefit or price premium is established.</w:t>
       </w:r>
     </w:p>
     <w:p>
@@ -731,21 +625,7 @@
         <w:pStyle w:val="Heading1"/>
       </w:pPr>
       <w:r>
-        <w:t>Evaluate the opportunity</w:t>
-      </w:r>
-    </w:p>
-    <w:p>
-      <w:pPr>
-        <w:pStyle w:val="Heading2"/>
-      </w:pPr>
-      <w:r>
-        <w:t>4:15–4:30 | Slide 16: Ask. Observe. Then commit.</w:t>
-      </w:r>
-    </w:p>
-    <w:p>
-      <w:pPr/>
-      <w:r>
-        <w:t>First, interview actual buyers. Then show the concept and prototype at a viable price. Finally, confirm supplier quality, costs and terms before a real purchase test. Survey interest alone is insufficient.</w:t>
+        <w:t>SLIDE 07 / Discovery gets attention. Meaning may explain the purchase.</w:t>
       </w:r>
     </w:p>
     <w:p>
@@ -756,7 +636,7 @@
           <w:color w:val="776C7B"/>
           <w:sz w:val="18"/>
         </w:rPr>
-        <w:t>Visual: Show the sequence of behaviour research, concept testing and supplier/purchase validation. Keep demo clicks separate from fieldwork.</w:t>
+        <w:t>2:30–3:00 | 30 seconds | 72 spoken words</w:t>
       </w:r>
     </w:p>
     <w:p>
@@ -764,13 +644,21 @@
         <w:pStyle w:val="Heading2"/>
       </w:pPr>
       <w:r>
-        <w:t>4:30–4:45 | Slide 17: Start small. Earn the next batch.</w:t>
+        <w:t>SAY THIS</w:t>
       </w:r>
     </w:p>
     <w:p>
       <w:pPr/>
       <w:r>
-        <w:t>Start with one collection. Continue only when people prefer it at a viable price, quality is consistent, and orders cover the batch. Let weak results change the idea.</w:t>
+        <w:t>The second concept is social influence. Online reviews can bring an old toy back into someone’s attention. Seeing other adults enjoy it may also make the purchase feel more acceptable. But discovery and motivation are different. A review could make someone notice a squishy, while a personal memory gives them a reason to choose it. We therefore need to ask both how they discovered the toy and why they actually bought it.</w:t>
+      </w:r>
+    </w:p>
+    <w:p>
+      <w:pPr>
+        <w:pStyle w:val="Heading2"/>
+      </w:pPr>
+      <w:r>
+        <w:t>PRESENTER CUE — do not read aloud</w:t>
       </w:r>
     </w:p>
     <w:p>
@@ -781,26 +669,7 @@
           <w:color w:val="776C7B"/>
           <w:sz w:val="18"/>
         </w:rPr>
-        <w:t>Visual: End with three pilot gates and the clickable prototype link.</w:t>
-      </w:r>
-    </w:p>
-    <w:p>
-      <w:pPr>
-        <w:pStyle w:val="Heading2"/>
-      </w:pPr>
-      <w:r>
-        <w:t>4:45–4:50 | Slide 18: Sources &amp; prototype</w:t>
-      </w:r>
-    </w:p>
-    <w:p>
-      <w:pPr/>
-      <w:r>
-        <w:rPr>
-          <w:i/>
-          <w:color w:val="776C7B"/>
-          <w:sz w:val="18"/>
-        </w:rPr>
-        <w:t>Visual: Silent five-second source card. All eighteen slides are part of the presentation; full source notes accompany the files.</w:t>
+        <w:t>Follow reported discovery, interpreted relevance and a real choice still to test. S1 supports the first stage.</w:t>
       </w:r>
     </w:p>
     <w:p>
@@ -813,7 +682,646 @@
         <w:pStyle w:val="Heading1"/>
       </w:pPr>
       <w:r>
-        <w:t>After fieldwork</w:t>
+        <w:t>SLIDE 08 / Bring a familiar memory into my everyday life.</w:t>
+      </w:r>
+    </w:p>
+    <w:p>
+      <w:pPr/>
+      <w:r>
+        <w:rPr>
+          <w:i/>
+          <w:color w:val="776C7B"/>
+          <w:sz w:val="18"/>
+        </w:rPr>
+        <w:t>3:00–3:25 | 25 seconds | 58 spoken words</w:t>
+      </w:r>
+    </w:p>
+    <w:p>
+      <w:pPr>
+        <w:pStyle w:val="Heading2"/>
+      </w:pPr>
+      <w:r>
+        <w:t>SAY THIS</w:t>
+      </w:r>
+    </w:p>
+    <w:p>
+      <w:pPr/>
+      <w:r>
+        <w:t>These ideas lead to the proposed value: bring a familiar memory into everyday life. REPLAY LAB combines three benefits. Meaning comes from a childhood reference. Choice comes from personal details. Confidence would come from clear samples, prices and order terms. The business needs to test whether customers value this combination enough to choose it over an ordinary toy.</w:t>
+      </w:r>
+    </w:p>
+    <w:p>
+      <w:pPr>
+        <w:pStyle w:val="Heading2"/>
+      </w:pPr>
+      <w:r>
+        <w:t>PRESENTER CUE — do not read aloud</w:t>
+      </w:r>
+    </w:p>
+    <w:p>
+      <w:pPr/>
+      <w:r>
+        <w:rPr>
+          <w:i/>
+          <w:color w:val="776C7B"/>
+          <w:sz w:val="18"/>
+        </w:rPr>
+        <w:t>Present the proposed customer job and the three benefits. This is a value hypothesis.</w:t>
+      </w:r>
+    </w:p>
+    <w:p>
+      <w:r>
+        <w:br w:type="page"/>
+      </w:r>
+    </w:p>
+    <w:p>
+      <w:pPr>
+        <w:pStyle w:val="Heading1"/>
+      </w:pPr>
+      <w:r>
+        <w:t>SLIDE 09 / A shared memory. A personal object.</w:t>
+      </w:r>
+    </w:p>
+    <w:p>
+      <w:pPr/>
+      <w:r>
+        <w:rPr>
+          <w:i/>
+          <w:color w:val="776C7B"/>
+          <w:sz w:val="18"/>
+        </w:rPr>
+        <w:t>3:25–3:50 | 25 seconds | 59 spoken words</w:t>
+      </w:r>
+    </w:p>
+    <w:p>
+      <w:pPr>
+        <w:pStyle w:val="Heading2"/>
+      </w:pPr>
+      <w:r>
+        <w:t>SAY THIS</w:t>
+      </w:r>
+    </w:p>
+    <w:p>
+      <w:pPr/>
+      <w:r>
+        <w:t>Here are three starting concepts: a pencil-case squishy, a gamepad squishy and cloud slime. Each suggests a different childhood moment, such as school supplies, weekend games or a treat after school. These are proposed themes, not proven customer preferences. Starting with a small selection would let us test which theme connects with buyers before spending money on more designs.</w:t>
+      </w:r>
+    </w:p>
+    <w:p>
+      <w:pPr>
+        <w:pStyle w:val="Heading2"/>
+      </w:pPr>
+      <w:r>
+        <w:t>PRESENTER CUE — do not read aloud</w:t>
+      </w:r>
+    </w:p>
+    <w:p>
+      <w:pPr/>
+      <w:r>
+        <w:rPr>
+          <w:i/>
+          <w:color w:val="776C7B"/>
+          <w:sz w:val="18"/>
+        </w:rPr>
+        <w:t>Show actual prototype artwork. The themes are proposed, not observed customer preferences. S2 supplies sensory-product context.</w:t>
+      </w:r>
+    </w:p>
+    <w:p>
+      <w:r>
+        <w:br w:type="page"/>
+      </w:r>
+    </w:p>
+    <w:p>
+      <w:pPr>
+        <w:pStyle w:val="Heading1"/>
+      </w:pPr>
+      <w:r>
+        <w:t>SLIDE 10 / Four choices. One personal object.</w:t>
+      </w:r>
+    </w:p>
+    <w:p>
+      <w:pPr/>
+      <w:r>
+        <w:rPr>
+          <w:i/>
+          <w:color w:val="776C7B"/>
+          <w:sz w:val="18"/>
+        </w:rPr>
+        <w:t>3:50–4:15 | 25 seconds | 61 spoken words</w:t>
+      </w:r>
+    </w:p>
+    <w:p>
+      <w:pPr>
+        <w:pStyle w:val="Heading2"/>
+      </w:pPr>
+      <w:r>
+        <w:t>SAY THIS</w:t>
+      </w:r>
+    </w:p>
+    <w:p>
+      <w:pPr/>
+      <w:r>
+        <w:t>The website turns that idea into four design steps: shape, colour, feel and story. A customer chooses the product, changes its appearance, selects sensory preferences and adds a name or memory. For a desk, they might prefer quiet and unscented options. The screen demonstrates those choices, but it cannot prove the real texture or smell. Physical samples would still be essential.</w:t>
+      </w:r>
+    </w:p>
+    <w:p>
+      <w:pPr>
+        <w:pStyle w:val="Heading2"/>
+      </w:pPr>
+      <w:r>
+        <w:t>PRESENTER CUE — do not read aloud</w:t>
+      </w:r>
+    </w:p>
+    <w:p>
+      <w:pPr/>
+      <w:r>
+        <w:rPr>
+          <w:i/>
+          <w:color w:val="776C7B"/>
+          <w:sz w:val="18"/>
+        </w:rPr>
+        <w:t>Follow the four studio steps. Explain that real textures and scents need supplier-made samples.</w:t>
+      </w:r>
+    </w:p>
+    <w:p>
+      <w:r>
+        <w:br w:type="page"/>
+      </w:r>
+    </w:p>
+    <w:p>
+      <w:pPr>
+        <w:pStyle w:val="Heading1"/>
+      </w:pPr>
+      <w:r>
+        <w:t>SLIDE 11 / From a memory to a viable batch.</w:t>
+      </w:r>
+    </w:p>
+    <w:p>
+      <w:pPr/>
+      <w:r>
+        <w:rPr>
+          <w:i/>
+          <w:color w:val="776C7B"/>
+          <w:sz w:val="18"/>
+        </w:rPr>
+        <w:t>4:15–4:55 | 40 seconds | 79 spoken words</w:t>
+      </w:r>
+    </w:p>
+    <w:p>
+      <w:pPr>
+        <w:pStyle w:val="Heading2"/>
+      </w:pPr>
+      <w:r>
+        <w:t>SAY THIS</w:t>
+      </w:r>
+    </w:p>
+    <w:p>
+      <w:pPr/>
+      <w:r>
+        <w:t>Let me show how the prototype works, from design to a saved reservation.</w:t>
+      </w:r>
+    </w:p>
+    <w:p>
+      <w:pPr/>
+      <w:r>
+        <w:t>First, choose a gamepad shape. Change its colour, then name it Saturday Save Point. Save the design and add it to the demo bag. Review the illustrative price and confirm that this is a simulation. After confirming, the reservation appears in the notebook. No payment is taken and no product is ordered.</w:t>
+      </w:r>
+    </w:p>
+    <w:p>
+      <w:pPr/>
+      <w:r>
+        <w:t>A real launch would also need supplier checks and clear production or refund terms.</w:t>
+      </w:r>
+    </w:p>
+    <w:p>
+      <w:pPr>
+        <w:pStyle w:val="Heading2"/>
+      </w:pPr>
+      <w:r>
+        <w:t>PRESENTER CUE — do not read aloud</w:t>
+      </w:r>
+    </w:p>
+    <w:p>
+      <w:pPr/>
+      <w:r>
+        <w:rPr>
+          <w:i/>
+          <w:color w:val="776C7B"/>
+          <w:sz w:val="18"/>
+        </w:rPr>
+        <w:t>0–7 seconds: read the introduction with the poster visible. At 7 seconds, click the embedded 25-second MP4 and read the middle paragraph over it. Use the final 8 seconds for the closing paragraph. The full 40-second slide slot already includes the demo; do not add another 25 seconds. Use the standalone MP4 if your presentation application cannot play the embedded clip.</w:t>
+      </w:r>
+    </w:p>
+    <w:p>
+      <w:r>
+        <w:br w:type="page"/>
+      </w:r>
+    </w:p>
+    <w:p>
+      <w:pPr>
+        <w:pStyle w:val="Heading1"/>
+      </w:pPr>
+      <w:r>
+        <w:t>SLIDE 12 / Personal meaning. Manageable production.</w:t>
+      </w:r>
+    </w:p>
+    <w:p>
+      <w:pPr/>
+      <w:r>
+        <w:rPr>
+          <w:i/>
+          <w:color w:val="776C7B"/>
+          <w:sz w:val="18"/>
+        </w:rPr>
+        <w:t>4:55–5:20 | 25 seconds | 61 spoken words</w:t>
+      </w:r>
+    </w:p>
+    <w:p>
+      <w:pPr>
+        <w:pStyle w:val="Heading2"/>
+      </w:pPr>
+      <w:r>
+        <w:t>SAY THIS</w:t>
+      </w:r>
+    </w:p>
+    <w:p>
+      <w:pPr/>
+      <w:r>
+        <w:t>This raises an important business question: how can we offer personal meaning without making every item completely from scratch? My proposal uses shared shapes within a collection, while customers choose selected details and memory cards. Custom squishies already exist, so I am not claiming global originality. The proposed difference is the combination of Thai childhood memories, adult use and customer participation.</w:t>
+      </w:r>
+    </w:p>
+    <w:p>
+      <w:pPr>
+        <w:pStyle w:val="Heading2"/>
+      </w:pPr>
+      <w:r>
+        <w:t>PRESENTER CUE — do not read aloud</w:t>
+      </w:r>
+    </w:p>
+    <w:p>
+      <w:pPr/>
+      <w:r>
+        <w:rPr>
+          <w:i/>
+          <w:color w:val="776C7B"/>
+          <w:sz w:val="18"/>
+        </w:rPr>
+        <w:t>Compare shared recipe and personal details. S5 demonstrates existing custom squishies; do not claim global novelty.</w:t>
+      </w:r>
+    </w:p>
+    <w:p>
+      <w:r>
+        <w:br w:type="page"/>
+      </w:r>
+    </w:p>
+    <w:p>
+      <w:pPr>
+        <w:pStyle w:val="Heading1"/>
+      </w:pPr>
+      <w:r>
+        <w:t>SLIDE 13 / Sell the object. Keep the options focused.</w:t>
+      </w:r>
+    </w:p>
+    <w:p>
+      <w:pPr/>
+      <w:r>
+        <w:rPr>
+          <w:i/>
+          <w:color w:val="776C7B"/>
+          <w:sz w:val="18"/>
+        </w:rPr>
+        <w:t>5:20–5:45 | 25 seconds | 62 spoken words</w:t>
+      </w:r>
+    </w:p>
+    <w:p>
+      <w:pPr>
+        <w:pStyle w:val="Heading2"/>
+      </w:pPr>
+      <w:r>
+        <w:t>SAY THIS</w:t>
+      </w:r>
+    </w:p>
+    <w:p>
+      <w:pPr/>
+      <w:r>
+        <w:t>Revenue would come from selling the products and a limited range of upgrades. In the demo, squishies start at three hundred forty-nine baht and slime at two hundred ninety-nine baht. Larger sizes, finishing details or gift sleeves add to the price. These are illustrative amounts. We still need supplier quotes and customer testing to find a price that works for both sides.</w:t>
+      </w:r>
+    </w:p>
+    <w:p>
+      <w:pPr>
+        <w:pStyle w:val="Heading2"/>
+      </w:pPr>
+      <w:r>
+        <w:t>PRESENTER CUE — do not read aloud</w:t>
+      </w:r>
+    </w:p>
+    <w:p>
+      <w:pPr/>
+      <w:r>
+        <w:rPr>
+          <w:i/>
+          <w:color w:val="776C7B"/>
+          <w:sz w:val="18"/>
+        </w:rPr>
+        <w:t>Present sample catalogue prices and optional upgrades as assumptions. Actual delivery costs and product terms remain unconfirmed.</w:t>
+      </w:r>
+    </w:p>
+    <w:p>
+      <w:r>
+        <w:br w:type="page"/>
+      </w:r>
+    </w:p>
+    <w:p>
+      <w:pPr>
+        <w:pStyle w:val="Heading1"/>
+      </w:pPr>
+      <w:r>
+        <w:t>SLIDE 14 / Three risks. Three practical tests.</w:t>
+      </w:r>
+    </w:p>
+    <w:p>
+      <w:pPr/>
+      <w:r>
+        <w:rPr>
+          <w:i/>
+          <w:color w:val="776C7B"/>
+          <w:sz w:val="18"/>
+        </w:rPr>
+        <w:t>5:45–6:20 | 35 seconds | 77 spoken words</w:t>
+      </w:r>
+    </w:p>
+    <w:p>
+      <w:pPr>
+        <w:pStyle w:val="Heading2"/>
+      </w:pPr>
+      <w:r>
+        <w:t>SAY THIS</w:t>
+      </w:r>
+    </w:p>
+    <w:p>
+      <w:pPr/>
+      <w:r>
+        <w:t>There are three main risks. First, customers may like the idea but choose a cheaper toy. We should compare prototypes at realistic prices. Second, too many options could create production problems, so we should limit the range and check samples. Third, nostalgia may lead to only one purchase. We need to understand repeat-use or gifting reasons. The OCPB report also highlights product-information concerns at some sellers, making supplier and label checks part of the proposed launch process.</w:t>
+      </w:r>
+    </w:p>
+    <w:p>
+      <w:pPr>
+        <w:pStyle w:val="Heading2"/>
+      </w:pPr>
+      <w:r>
+        <w:t>PRESENTER CUE — do not read aloud</w:t>
+      </w:r>
+    </w:p>
+    <w:p>
+      <w:pPr/>
+      <w:r>
+        <w:rPr>
+          <w:i/>
+          <w:color w:val="776C7B"/>
+          <w:sz w:val="18"/>
+        </w:rPr>
+        <w:t>Use the risk/test/result table. S4 reports incomplete labels at some sellers; avoid generalising to all toys.</w:t>
+      </w:r>
+    </w:p>
+    <w:p>
+      <w:r>
+        <w:br w:type="page"/>
+      </w:r>
+    </w:p>
+    <w:p>
+      <w:pPr>
+        <w:pStyle w:val="Heading1"/>
+      </w:pPr>
+      <w:r>
+        <w:t>SLIDE 15 / Make the batch pay for itself.</w:t>
+      </w:r>
+    </w:p>
+    <w:p>
+      <w:pPr/>
+      <w:r>
+        <w:rPr>
+          <w:i/>
+          <w:color w:val="776C7B"/>
+          <w:sz w:val="18"/>
+        </w:rPr>
+        <w:t>6:20–7:00 | 40 seconds | 82 spoken words</w:t>
+      </w:r>
+    </w:p>
+    <w:p>
+      <w:pPr>
+        <w:pStyle w:val="Heading2"/>
+      </w:pPr>
+      <w:r>
+        <w:t>SAY THIS</w:t>
+      </w:r>
+    </w:p>
+    <w:p>
+      <w:pPr/>
+      <w:r>
+        <w:t>Now let us look at the illustrative economics. If a squishy sells for three hundred forty-nine baht and its variable cost is one hundred ninety-nine, the contribution is one hundred fifty baht per unit. This is the amount available to cover fixed costs, not final profit. With four thousand five hundred baht in setup costs, thirty units would cover that setup amount. The actual threshold must also meet the supplier’s minimum and account for all relevant costs, including fees, defects and delivery.</w:t>
+      </w:r>
+    </w:p>
+    <w:p>
+      <w:pPr>
+        <w:pStyle w:val="Heading2"/>
+      </w:pPr>
+      <w:r>
+        <w:t>PRESENTER CUE — do not read aloud</w:t>
+      </w:r>
+    </w:p>
+    <w:p>
+      <w:pPr/>
+      <w:r>
+        <w:rPr>
+          <w:i/>
+          <w:color w:val="776C7B"/>
+          <w:sz w:val="18"/>
+        </w:rPr>
+        <w:t>Follow the proportional price bar, then the setup/contribution calculation. All numbers require real quotes and demand validation.</w:t>
+      </w:r>
+    </w:p>
+    <w:p>
+      <w:r>
+        <w:br w:type="page"/>
+      </w:r>
+    </w:p>
+    <w:p>
+      <w:pPr>
+        <w:pStyle w:val="Heading1"/>
+      </w:pPr>
+      <w:r>
+        <w:t>SLIDE 16 / Ask. Observe. Then commit.</w:t>
+      </w:r>
+    </w:p>
+    <w:p>
+      <w:pPr/>
+      <w:r>
+        <w:rPr>
+          <w:i/>
+          <w:color w:val="776C7B"/>
+          <w:sz w:val="18"/>
+        </w:rPr>
+        <w:t>7:00–7:25 | 25 seconds | 63 spoken words</w:t>
+      </w:r>
+    </w:p>
+    <w:p>
+      <w:pPr>
+        <w:pStyle w:val="Heading2"/>
+      </w:pPr>
+      <w:r>
+        <w:t>SAY THIS</w:t>
+      </w:r>
+    </w:p>
+    <w:p>
+      <w:pPr/>
+      <w:r>
+        <w:t>To test the idea, I would follow three stages. First, ask actual buyers about their recent purchases. Second, introduce the concept and compare reactions to a prototype at a viable price. Third, confirm supplier samples, costs and terms before testing real orders. The questionnaire supports this process, but positive answers alone do not prove demand. Website demo reservations are also not real sales.</w:t>
+      </w:r>
+    </w:p>
+    <w:p>
+      <w:pPr>
+        <w:pStyle w:val="Heading2"/>
+      </w:pPr>
+      <w:r>
+        <w:t>PRESENTER CUE — do not read aloud</w:t>
+      </w:r>
+    </w:p>
+    <w:p>
+      <w:pPr/>
+      <w:r>
+        <w:rPr>
+          <w:i/>
+          <w:color w:val="776C7B"/>
+          <w:sz w:val="18"/>
+        </w:rPr>
+        <w:t>Show the sequence of behaviour research, concept testing and supplier/purchase validation. Keep demo clicks separate from fieldwork.</w:t>
+      </w:r>
+    </w:p>
+    <w:p>
+      <w:r>
+        <w:br w:type="page"/>
+      </w:r>
+    </w:p>
+    <w:p>
+      <w:pPr>
+        <w:pStyle w:val="Heading1"/>
+      </w:pPr>
+      <w:r>
+        <w:t>SLIDE 17 / Start small. Earn the next batch.</w:t>
+      </w:r>
+    </w:p>
+    <w:p>
+      <w:pPr/>
+      <w:r>
+        <w:rPr>
+          <w:i/>
+          <w:color w:val="776C7B"/>
+          <w:sz w:val="18"/>
+        </w:rPr>
+        <w:t>7:25–7:50 | 25 seconds | 62 spoken words</w:t>
+      </w:r>
+    </w:p>
+    <w:p>
+      <w:pPr>
+        <w:pStyle w:val="Heading2"/>
+      </w:pPr>
+      <w:r>
+        <w:t>SAY THIS</w:t>
+      </w:r>
+    </w:p>
+    <w:p>
+      <w:pPr/>
+      <w:r>
+        <w:t>My recommendation is to begin with one collection and three decision rules. Customers must choose it at a viable price, product quality must be consistent, and confirmed orders must cover the batch. If those conditions fail, we should change the idea before expanding. REPLAY LAB offers a way to explore a childhood memory as a product, with evidence guiding what happens next.</w:t>
+      </w:r>
+    </w:p>
+    <w:p>
+      <w:pPr>
+        <w:pStyle w:val="Heading2"/>
+      </w:pPr>
+      <w:r>
+        <w:t>PRESENTER CUE — do not read aloud</w:t>
+      </w:r>
+    </w:p>
+    <w:p>
+      <w:pPr/>
+      <w:r>
+        <w:rPr>
+          <w:i/>
+          <w:color w:val="776C7B"/>
+          <w:sz w:val="18"/>
+        </w:rPr>
+        <w:t>End with three pilot gates and the clickable prototype link.</w:t>
+      </w:r>
+    </w:p>
+    <w:p>
+      <w:r>
+        <w:br w:type="page"/>
+      </w:r>
+    </w:p>
+    <w:p>
+      <w:pPr>
+        <w:pStyle w:val="Heading1"/>
+      </w:pPr>
+      <w:r>
+        <w:t>SLIDE 18 / Sources &amp; prototype</w:t>
+      </w:r>
+    </w:p>
+    <w:p>
+      <w:pPr/>
+      <w:r>
+        <w:rPr>
+          <w:i/>
+          <w:color w:val="776C7B"/>
+          <w:sz w:val="18"/>
+        </w:rPr>
+        <w:t>7:50–8:00 | 10 seconds | 21 spoken words</w:t>
+      </w:r>
+    </w:p>
+    <w:p>
+      <w:pPr>
+        <w:pStyle w:val="Heading2"/>
+      </w:pPr>
+      <w:r>
+        <w:t>SAY THIS</w:t>
+      </w:r>
+    </w:p>
+    <w:p>
+      <w:pPr/>
+      <w:r>
+        <w:t>These are the sources and prototype behind the proposal. The supporting files include the questionnaire and assumptions. Thank you for listening.</w:t>
+      </w:r>
+    </w:p>
+    <w:p>
+      <w:pPr>
+        <w:pStyle w:val="Heading2"/>
+      </w:pPr>
+      <w:r>
+        <w:t>PRESENTER CUE — do not read aloud</w:t>
+      </w:r>
+    </w:p>
+    <w:p>
+      <w:pPr/>
+      <w:r>
+        <w:rPr>
+          <w:i/>
+          <w:color w:val="776C7B"/>
+          <w:sz w:val="18"/>
+        </w:rPr>
+        <w:t>Keep the source card visible while saying the closing lines. No extra silent credit interval is needed; this ten-second slide is included in the eight minutes.</w:t>
+      </w:r>
+    </w:p>
+    <w:p>
+      <w:r>
+        <w:br w:type="page"/>
+      </w:r>
+    </w:p>
+    <w:p>
+      <w:pPr>
+        <w:pStyle w:val="Heading1"/>
+      </w:pPr>
+      <w:r>
+        <w:t>After fieldwork — optional replacement</w:t>
       </w:r>
     </w:p>
     <w:p>
@@ -830,7 +1338,7 @@
           <w:color w:val="776C7B"/>
           <w:sz w:val="18"/>
         </w:rPr>
-        <w:t>Use only counts and quotations you actually collected. Keep the replacement near 40 words. If adult buyers do not report nostalgia or social discovery, say so and adjust the explanation. Label any translated quote accurately.</w:t>
+        <w:t>This template is not part of the spoken script. Replace brackets only with evidence you actually collected. Add one sentence explaining the limits of your sample; aim for about 60 words total to fit slide 4. If nostalgia or online discovery is not supported, say so.</w:t>
       </w:r>
     </w:p>
     <w:p>
@@ -838,7 +1346,7 @@
         <w:pStyle w:val="Heading2"/>
       </w:pPr>
       <w:r>
-        <w:t>Likely questions</w:t>
+        <w:t>If asked after the presentation</w:t>
       </w:r>
     </w:p>
     <w:p>
@@ -846,13 +1354,13 @@
         <w:pStyle w:val="Heading2"/>
       </w:pPr>
       <w:r>
-        <w:t>Is this completely new?</w:t>
+        <w:t>Is the idea completely new?</w:t>
       </w:r>
     </w:p>
     <w:p>
       <w:pPr/>
       <w:r>
-        <w:t>No global novelty claim is made. Custom squishies already exist. The proposed combination is Thai childhood memories, co-design and viable small batches for adult buyers.</w:t>
+        <w:t>No. Custom squishies already exist. The proposal combines Thai childhood memories, adult use and customer participation; its differentiation still needs testing.</w:t>
       </w:r>
     </w:p>
     <w:p>
@@ -860,13 +1368,13 @@
         <w:pStyle w:val="Heading2"/>
       </w:pPr>
       <w:r>
-        <w:t>Why use pre-orders?</w:t>
+        <w:t>Does the website prove demand?</w:t>
       </w:r>
     </w:p>
     <w:p>
       <w:pPr/>
       <w:r>
-        <w:t>To test commitment before a production run and avoid making an unviable batch. Production still requires supplier checks, clear terms and a workable refund process.</w:t>
+        <w:t>No. It demonstrates the journey. Browser-local simulated reservations do not establish willingness to pay.</w:t>
       </w:r>
     </w:p>
     <w:p>
@@ -874,41 +1382,13 @@
         <w:pStyle w:val="Heading2"/>
       </w:pPr>
       <w:r>
-        <w:t>What does the website prove?</w:t>
+        <w:t>Is thirty units the actual production minimum?</w:t>
       </w:r>
     </w:p>
     <w:p>
       <w:pPr/>
       <w:r>
-        <w:t>It proves the proposed journey can be demonstrated. Browser-local demo clicks and reservations do not prove market demand.</w:t>
-      </w:r>
-    </w:p>
-    <w:p>
-      <w:pPr>
-        <w:pStyle w:val="Heading2"/>
-      </w:pPr>
-      <w:r>
-        <w:t>How is the threshold calculated?</w:t>
-      </w:r>
-    </w:p>
-    <w:p>
-      <w:pPr/>
-      <w:r>
-        <w:t>Use the higher of the supplier minimum order quantity and fixed setup cost divided by contribution per unit, rounded up. The example assumes THB 349 price, THB 199 variable cost and THB 4,500 fixed cost: 30 units before any higher supplier minimum.</w:t>
-      </w:r>
-    </w:p>
-    <w:p>
-      <w:pPr>
-        <w:pStyle w:val="Heading2"/>
-      </w:pPr>
-      <w:r>
-        <w:t>What would stop the pilot?</w:t>
-      </w:r>
-    </w:p>
-    <w:p>
-      <w:pPr/>
-      <w:r>
-        <w:t>Low preference at a viable price, inconsistent product quality, weak reservations after real terms are shown, or costs that exceed the batch’s contribution.</w:t>
+        <w:t>No. It is the illustrative setup-cost break-even point. The actual batch threshold must also satisfy supplier minimums and all relevant costs.</w:t>
       </w:r>
     </w:p>
     <w:sectPr>

</xml_diff>

<commit_message>
Include presenter market interview as qualitative field evidence
</commit_message>
<xml_diff>
--- a/downloads/REPLAY_LAB_Script.docx
+++ b/downloads/REPLAY_LAB_Script.docx
@@ -32,7 +32,7 @@
     <w:p>
       <w:pPr/>
       <w:r>
-        <w:t>1,112 spoken words across 18 slides. Each slide has its own page: read only the text under SAY THIS. The slide title, timing and presenter cues are not spoken. This expanded edition replaces the earlier five-minute version.</w:t>
+        <w:t>1,105 spoken words across 18 slides. Each slide has its own page: read only the text under SAY THIS. The slide title, timing and presenter cues are not spoken. This expanded edition replaces the earlier five-minute version.</w:t>
       </w:r>
     </w:p>
     <w:p>
@@ -66,7 +66,7 @@
     <w:p>
       <w:pPr/>
       <w:r>
-        <w:t>Slide 4 explains that original fieldwork is pending. Replace its narration with your own verified observations or interviews when available, keeping roughly 60 words. Do not read the sample replacement template as a finding. Demo votes and reservations are simulations, not consumer research.</w:t>
+        <w:t>Slide 4 now includes your informal interview at a market near your internship. The English text paraphrases your account: the interviewee said working adults often come to squeeze and play with the toys. It is not a customer count or a confirmed reason for buying. Market name, date and interviewee role still need confirmation. Demo activity remains simulated.</w:t>
       </w:r>
     </w:p>
     <w:tbl>
@@ -454,7 +454,7 @@
         <w:pStyle w:val="Heading1"/>
       </w:pPr>
       <w:r>
-        <w:t>SLIDE 04 / A promising signal. An evidence gap to close.</w:t>
+        <w:t>SLIDE 04 / A local interview. A signal of adult interest.</w:t>
       </w:r>
     </w:p>
     <w:p>
@@ -465,7 +465,7 @@
           <w:color w:val="776C7B"/>
           <w:sz w:val="18"/>
         </w:rPr>
-        <w:t>1:10–1:35 | 25 seconds | 62 spoken words</w:t>
+        <w:t>1:10–1:35 | 25 seconds | 58 spoken words</w:t>
       </w:r>
     </w:p>
     <w:p>
@@ -479,7 +479,7 @@
     <w:p>
       <w:pPr/>
       <w:r>
-        <w:t>Before explaining the business, I want to separate published evidence from my own research. Original fieldwork is still pending, and the Mega Plaza report mainly observed children and teenagers. It does not independently confirm adult demand. My next step is to interview working adults about their actual purchases, before showing them REPLAY LAB, so the concept does not shape their initial answers.</w:t>
+        <w:t>For my own evidence, I interviewed someone at a market near my internship. They told me that working adults also often come to squeeze and play with these toys. This suggests interest in the hands-on experience. However, it is an interview account, not a count of customers. It does not establish purchases, childhood nostalgia or growth over time.</w:t>
       </w:r>
     </w:p>
     <w:p>
@@ -498,7 +498,7 @@
           <w:color w:val="776C7B"/>
           <w:sz w:val="18"/>
         </w:rPr>
-        <w:t>Replace this plan with actual dated observations, buyer counts and one consented quote before submission. Published news is not personal fieldwork.</w:t>
+        <w:t>Present S6 as an English paraphrase of the informal interview you described, not a verbatim quotation or direct observation. The market name, interview date and interviewee role have not yet been supplied. Add these only when confirmed. Do not turn the description of many adults into a numerical result.</w:t>
       </w:r>
     </w:p>
     <w:p>
@@ -579,7 +579,7 @@
           <w:color w:val="776C7B"/>
           <w:sz w:val="18"/>
         </w:rPr>
-        <w:t>2:00–2:30 | 30 seconds | 66 spoken words</w:t>
+        <w:t>2:00–2:30 | 30 seconds | 64 spoken words</w:t>
       </w:r>
     </w:p>
     <w:p>
@@ -593,7 +593,7 @@
     <w:p>
       <w:pPr/>
       <w:r>
-        <w:t>The first consumer behaviour concept is emotional motivation. A familiar shape may remind someone of an after-school routine or a game they enjoyed. The texture may also be enjoyable on its own. Adult income then gives that person more freedom to choose. My interpretation is that memory, enjoyment and choice could work together. However, emotional meaning does not automatically mean customers will pay a higher price.</w:t>
+        <w:t>The first consumer behaviour concept is emotional motivation. My interview account points to the appeal of touching and playing with the toys. The published report adds a possible link to childhood wishes. I interpret these as two possible benefits: sensory enjoyment and personal meaning. However, the interview did not establish nostalgia or willingness to pay. Those explanations still need direct questions to adult buyers.</w:t>
       </w:r>
     </w:p>
     <w:p>
@@ -612,7 +612,7 @@
           <w:color w:val="776C7B"/>
           <w:sz w:val="18"/>
         </w:rPr>
-        <w:t>Explain memory, enjoyment and choice as an interpretation to test. No medical benefit or price premium is established.</w:t>
+        <w:t>Separate S6, which reports adult squeezing and playing, from S1, which supplies the childhood-wish account. Sensory enjoyment and nostalgia are interpretations, not motives confirmed by the local interview.</w:t>
       </w:r>
     </w:p>
     <w:p>
@@ -1161,7 +1161,7 @@
           <w:color w:val="776C7B"/>
           <w:sz w:val="18"/>
         </w:rPr>
-        <w:t>7:00–7:25 | 25 seconds | 63 spoken words</w:t>
+        <w:t>7:00–7:25 | 25 seconds | 62 spoken words</w:t>
       </w:r>
     </w:p>
     <w:p>
@@ -1175,7 +1175,7 @@
     <w:p>
       <w:pPr/>
       <w:r>
-        <w:t>To test the idea, I would follow three stages. First, ask actual buyers about their recent purchases. Second, introduce the concept and compare reactions to a prototype at a viable price. Third, confirm supplier samples, costs and terms before testing real orders. The questionnaire supports this process, but positive answers alone do not prove demand. Website demo reservations are also not real sales.</w:t>
+        <w:t>To develop this initial interview, I would follow three stages. First, ask adult buyers about their recent purchases and reasons for trying the toys. Second, compare reactions to the concept at a viable price. Third, confirm supplier samples, costs and terms before testing real orders. The questionnaire supports this process, but positive answers and website demo reservations do not prove real demand.</w:t>
       </w:r>
     </w:p>
     <w:p>
@@ -1321,13 +1321,13 @@
         <w:pStyle w:val="Heading1"/>
       </w:pPr>
       <w:r>
-        <w:t>After fieldwork — optional replacement</w:t>
+        <w:t>Complete the interview source note</w:t>
       </w:r>
     </w:p>
     <w:p>
       <w:pPr/>
       <w:r>
-        <w:t>On [DATE], I visited [N] shops in [PLACE] and interviewed [N] working-adult buyers. [X] mentioned childhood memories; [Y] mentioned online reviews. One said, [EXACT QUOTE]. This small convenience sample [supports / complicates] the reported pattern.</w:t>
+        <w:t>When available, add the market name, interview date and the interviewee’s role. Keep the original notes or recording if available. Do not label a paraphrase as an exact quotation.</w:t>
       </w:r>
     </w:p>
     <w:p>
@@ -1338,7 +1338,7 @@
           <w:color w:val="776C7B"/>
           <w:sz w:val="18"/>
         </w:rPr>
-        <w:t>This template is not part of the spoken script. Replace brackets only with evidence you actually collected. Add one sentence explaining the limits of your sample; aim for about 60 words total to fit slide 4. If nostalgia or online discovery is not supported, say so.</w:t>
+        <w:t>This guidance is not part of the spoken script. The interview supports a local account of adult interest in squeezing and playing. It does not establish how many people bought, why they bought, or whether the behaviour increased over time. Ask follow-up questions before making those claims.</w:t>
       </w:r>
     </w:p>
     <w:p>

</xml_diff>